<commit_message>
Rebuild protocols from evidence-based source; remove orphaned duplicates
Regenerates all therapy protocols from the evidence-based reference document
rather than the earlier uncited export.

- 75 protocols rebuilt with primary literature citations (6pt italic)
- Removes 7 placeholder stubs, incl. all six nerve-palsy tendon transfers,
  finger stiffness, and ulnar-sided wrist pain
- Deletes 75 orphaned duplicates created by the previous commit, including
  28 patient-education docs misfiled into therapy-protocols/
- Preserves 9 pre-existing protocols not covered by the source document
- Regenerates js/protocols.js from actual folder contents: 84 entries,
  84 files, verified in both directions (no dead links, no orphaned files)

Co-Authored-By: Claude Opus 5 <noreply@anthropic.com>
</commit_message>
<xml_diff>
--- a/therapy-protocols/Elbow-Radial-Head-Olecranon-ORIF.docx
+++ b/therapy-protocols/Elbow-Radial-Head-Olecranon-ORIF.docx
@@ -4,7 +4,7 @@
   <w:body>
     <w:p>
       <w:pPr>
-        <w:spacing w:before="0" w:after="40" w:line="264" w:lineRule="exact"/>
+        <w:spacing w:before="0" w:after="60" w:line="269" w:lineRule="exact"/>
         <w:jc w:val="center"/>
       </w:pPr>
       <w:r>
@@ -18,7 +18,7 @@
     </w:p>
     <w:p>
       <w:pPr>
-        <w:spacing w:before="0" w:after="40" w:line="176" w:lineRule="exact"/>
+        <w:spacing w:before="0" w:after="20" w:line="179" w:lineRule="exact"/>
         <w:jc w:val="left"/>
       </w:pPr>
       <w:r>
@@ -27,12 +27,26 @@
           <w:i w:val="0"/>
           <w:sz w:val="16"/>
         </w:rPr>
-        <w:t>Name: _______________________  Date of Surgery: ___________  Frequency: 2-3x/week</w:t>
+        <w:t>Name: _____________________  Diagnosis: _____________________  Date of Surgery: ____________</w:t>
       </w:r>
     </w:p>
     <w:p>
       <w:pPr>
-        <w:spacing w:before="40" w:after="20" w:line="220" w:lineRule="exact"/>
+        <w:spacing w:before="0" w:after="60" w:line="179" w:lineRule="exact"/>
+        <w:jc w:val="left"/>
+      </w:pPr>
+      <w:r>
+        <w:rPr>
+          <w:b w:val="0"/>
+          <w:i w:val="0"/>
+          <w:sz w:val="16"/>
+        </w:rPr>
+        <w:t>Frequency: 2-3 times / week</w:t>
+      </w:r>
+    </w:p>
+    <w:p>
+      <w:pPr>
+        <w:spacing w:before="60" w:after="20" w:line="224" w:lineRule="exact"/>
         <w:jc w:val="left"/>
       </w:pPr>
       <w:r>
@@ -46,7 +60,7 @@
     </w:p>
     <w:p>
       <w:pPr>
-        <w:spacing w:before="0" w:after="40" w:line="198" w:lineRule="exact"/>
+        <w:spacing w:before="0" w:after="40" w:line="202" w:lineRule="exact"/>
         <w:jc w:val="left"/>
       </w:pPr>
       <w:r>
@@ -55,12 +69,26 @@
           <w:i w:val="0"/>
           <w:sz w:val="18"/>
         </w:rPr>
-        <w:t>Posterior splint. Finger/wrist ROM immediately.</w:t>
+        <w:t>Posterior splint.</w:t>
       </w:r>
     </w:p>
     <w:p>
       <w:pPr>
-        <w:spacing w:before="40" w:after="20" w:line="220" w:lineRule="exact"/>
+        <w:spacing w:before="0" w:after="40" w:line="202" w:lineRule="exact"/>
+        <w:jc w:val="left"/>
+      </w:pPr>
+      <w:r>
+        <w:rPr>
+          <w:b w:val="0"/>
+          <w:i w:val="0"/>
+          <w:sz w:val="18"/>
+        </w:rPr>
+        <w:t>Finger/wrist ROM immediately.</w:t>
+      </w:r>
+    </w:p>
+    <w:p>
+      <w:pPr>
+        <w:spacing w:before="60" w:after="20" w:line="224" w:lineRule="exact"/>
         <w:jc w:val="left"/>
       </w:pPr>
       <w:r>
@@ -74,7 +102,7 @@
     </w:p>
     <w:p>
       <w:pPr>
-        <w:spacing w:before="0" w:after="40" w:line="198" w:lineRule="exact"/>
+        <w:spacing w:before="0" w:after="40" w:line="202" w:lineRule="exact"/>
         <w:jc w:val="left"/>
       </w:pPr>
       <w:r>
@@ -83,12 +111,40 @@
           <w:i w:val="0"/>
           <w:sz w:val="18"/>
         </w:rPr>
-        <w:t>Begin AROM elbow flexion/extension and forearm rotation (if stable fixation). ROM goals: 30-120° initially, progressing to full. No resisted elbow extension (olecranon) or heavy lifting.</w:t>
+        <w:t>Begin AROM elbow flexion/extension and forearm rotation (if stable fixation).</w:t>
       </w:r>
     </w:p>
     <w:p>
       <w:pPr>
-        <w:spacing w:before="40" w:after="20" w:line="220" w:lineRule="exact"/>
+        <w:spacing w:before="0" w:after="40" w:line="202" w:lineRule="exact"/>
+        <w:jc w:val="left"/>
+      </w:pPr>
+      <w:r>
+        <w:rPr>
+          <w:b w:val="0"/>
+          <w:i w:val="0"/>
+          <w:sz w:val="18"/>
+        </w:rPr>
+        <w:t>ROM goals: 30-120° initially, progressing to full.</w:t>
+      </w:r>
+    </w:p>
+    <w:p>
+      <w:pPr>
+        <w:spacing w:before="0" w:after="40" w:line="202" w:lineRule="exact"/>
+        <w:jc w:val="left"/>
+      </w:pPr>
+      <w:r>
+        <w:rPr>
+          <w:b w:val="0"/>
+          <w:i w:val="0"/>
+          <w:sz w:val="18"/>
+        </w:rPr>
+        <w:t>No resisted elbow extension (olecranon) or heavy lifting.</w:t>
+      </w:r>
+    </w:p>
+    <w:p>
+      <w:pPr>
+        <w:spacing w:before="60" w:after="20" w:line="224" w:lineRule="exact"/>
         <w:jc w:val="left"/>
       </w:pPr>
       <w:r>
@@ -102,7 +158,7 @@
     </w:p>
     <w:p>
       <w:pPr>
-        <w:spacing w:before="0" w:after="40" w:line="198" w:lineRule="exact"/>
+        <w:spacing w:before="0" w:after="40" w:line="202" w:lineRule="exact"/>
         <w:jc w:val="left"/>
       </w:pPr>
       <w:r>
@@ -111,12 +167,26 @@
           <w:i w:val="0"/>
           <w:sz w:val="18"/>
         </w:rPr>
-        <w:t>Full AROM expected. Gentle isometrics.</w:t>
+        <w:t>Full AROM expected.</w:t>
       </w:r>
     </w:p>
     <w:p>
       <w:pPr>
-        <w:spacing w:before="40" w:after="20" w:line="220" w:lineRule="exact"/>
+        <w:spacing w:before="0" w:after="40" w:line="202" w:lineRule="exact"/>
+        <w:jc w:val="left"/>
+      </w:pPr>
+      <w:r>
+        <w:rPr>
+          <w:b w:val="0"/>
+          <w:i w:val="0"/>
+          <w:sz w:val="18"/>
+        </w:rPr>
+        <w:t>Gentle isometrics.</w:t>
+      </w:r>
+    </w:p>
+    <w:p>
+      <w:pPr>
+        <w:spacing w:before="60" w:after="20" w:line="224" w:lineRule="exact"/>
         <w:jc w:val="left"/>
       </w:pPr>
       <w:r>
@@ -130,7 +200,7 @@
     </w:p>
     <w:p>
       <w:pPr>
-        <w:spacing w:before="0" w:after="40" w:line="198" w:lineRule="exact"/>
+        <w:spacing w:before="0" w:after="40" w:line="202" w:lineRule="exact"/>
         <w:jc w:val="left"/>
       </w:pPr>
       <w:r>
@@ -139,12 +209,26 @@
           <w:i w:val="0"/>
           <w:sz w:val="18"/>
         </w:rPr>
-        <w:t>Progressive strengthening with bands and light weights. Return to full activity at 3-4 months per radiographic healing.</w:t>
+        <w:t>Progressive strengthening with bands and light weights.</w:t>
       </w:r>
     </w:p>
     <w:p>
       <w:pPr>
-        <w:spacing w:before="60" w:after="20" w:line="154" w:lineRule="exact"/>
+        <w:spacing w:before="0" w:after="40" w:line="202" w:lineRule="exact"/>
+        <w:jc w:val="left"/>
+      </w:pPr>
+      <w:r>
+        <w:rPr>
+          <w:b w:val="0"/>
+          <w:i w:val="0"/>
+          <w:sz w:val="18"/>
+        </w:rPr>
+        <w:t>Return to full activity at 3-4 months per radiographic healing.</w:t>
+      </w:r>
+    </w:p>
+    <w:p>
+      <w:pPr>
+        <w:spacing w:before="60" w:after="20" w:line="157" w:lineRule="exact"/>
         <w:jc w:val="left"/>
       </w:pPr>
       <w:r>
@@ -158,7 +242,21 @@
     </w:p>
     <w:p>
       <w:pPr>
-        <w:spacing w:before="0" w:after="0" w:line="176" w:lineRule="exact"/>
+        <w:spacing w:before="60" w:after="0" w:line="134" w:lineRule="exact"/>
+        <w:jc w:val="left"/>
+      </w:pPr>
+      <w:r>
+        <w:rPr>
+          <w:b w:val="0"/>
+          <w:i/>
+          <w:sz w:val="12"/>
+        </w:rPr>
+        <w:t>Primary Reference: Hak DJ, Golladay GJ. Olecranon fractures: treatment options. J Am Acad Orthop Surg, 2000; Duckworth AD et al. Radial head and neck fractures. J Hand Surg Am, 2012.</w:t>
+      </w:r>
+    </w:p>
+    <w:p>
+      <w:pPr>
+        <w:spacing w:before="80" w:after="0" w:line="179" w:lineRule="exact"/>
         <w:jc w:val="left"/>
       </w:pPr>
       <w:r>
@@ -167,7 +265,7 @@
           <w:i w:val="0"/>
           <w:sz w:val="16"/>
         </w:rPr>
-        <w:t>Signature: _____________________________  Date: ______________</w:t>
+        <w:t>Signature: _____________________________   Date: ______________</w:t>
       </w:r>
     </w:p>
     <w:sectPr>

</xml_diff>